<commit_message>
Added forward checking and MRV to be able to solve hard and edited metrics to be in baord
</commit_message>
<xml_diff>
--- a/Sudoku_CSP_Report.docx
+++ b/Sudoku_CSP_Report.docx
@@ -1557,6 +1557,24 @@
           <w:sz w:val="24"/>
           <w:szCs w:val="24"/>
         </w:rPr>
+        <w:t>--- TIMING ---</w:t>
+      </w:r>
+    </w:p>
+    <w:p>
+      <w:pPr>
+        <w:spacing w:after="0" w:line="240" w:lineRule="auto"/>
+        <w:rPr>
+          <w:rFonts w:ascii="Times New Roman" w:eastAsia="Times New Roman" w:hAnsi="Times New Roman" w:cs="Times New Roman"/>
+          <w:sz w:val="24"/>
+          <w:szCs w:val="24"/>
+        </w:rPr>
+      </w:pPr>
+      <w:r>
+        <w:rPr>
+          <w:rFonts w:ascii="Times New Roman" w:eastAsia="Times New Roman" w:hAnsi="Times New Roman" w:cs="Times New Roman"/>
+          <w:sz w:val="24"/>
+          <w:szCs w:val="24"/>
+        </w:rPr>
         <w:t>AC3 time (</w:t>
       </w:r>
       <w:proofErr w:type="spellStart"/>
@@ -1575,7 +1593,7 @@
           <w:sz w:val="24"/>
           <w:szCs w:val="24"/>
         </w:rPr>
-        <w:t>): 7.73</w:t>
+        <w:t>): 23.51</w:t>
       </w:r>
     </w:p>
     <w:p>
@@ -1611,7 +1629,35 @@
           <w:sz w:val="24"/>
           <w:szCs w:val="24"/>
         </w:rPr>
-        <w:t>): 0.01</w:t>
+        <w:t>): 0.02</w:t>
+      </w:r>
+    </w:p>
+    <w:p>
+      <w:pPr>
+        <w:spacing w:after="0" w:line="240" w:lineRule="auto"/>
+        <w:rPr>
+          <w:rFonts w:ascii="Times New Roman" w:eastAsia="Times New Roman" w:hAnsi="Times New Roman" w:cs="Times New Roman"/>
+          <w:sz w:val="24"/>
+          <w:szCs w:val="24"/>
+        </w:rPr>
+      </w:pPr>
+    </w:p>
+    <w:p>
+      <w:pPr>
+        <w:spacing w:after="0" w:line="240" w:lineRule="auto"/>
+        <w:rPr>
+          <w:rFonts w:ascii="Times New Roman" w:eastAsia="Times New Roman" w:hAnsi="Times New Roman" w:cs="Times New Roman"/>
+          <w:sz w:val="24"/>
+          <w:szCs w:val="24"/>
+        </w:rPr>
+      </w:pPr>
+      <w:r>
+        <w:rPr>
+          <w:rFonts w:ascii="Times New Roman" w:eastAsia="Times New Roman" w:hAnsi="Times New Roman" w:cs="Times New Roman"/>
+          <w:sz w:val="24"/>
+          <w:szCs w:val="24"/>
+        </w:rPr>
+        <w:t>--- METRICS ---</w:t>
       </w:r>
     </w:p>
     <w:p>
@@ -1665,7 +1711,7 @@
           <w:sz w:val="24"/>
           <w:szCs w:val="24"/>
         </w:rPr>
-        <w:t>Queue pushes: 3558</w:t>
+        <w:t>Queue pushes: 4578</w:t>
       </w:r>
     </w:p>
     <w:p>
@@ -1752,6 +1798,24 @@
           <w:sz w:val="24"/>
           <w:szCs w:val="24"/>
         </w:rPr>
+        <w:t>--- TIMING ---</w:t>
+      </w:r>
+    </w:p>
+    <w:p>
+      <w:pPr>
+        <w:spacing w:after="0" w:line="240" w:lineRule="auto"/>
+        <w:rPr>
+          <w:rFonts w:ascii="Times New Roman" w:eastAsia="Times New Roman" w:hAnsi="Times New Roman" w:cs="Times New Roman"/>
+          <w:sz w:val="24"/>
+          <w:szCs w:val="24"/>
+        </w:rPr>
+      </w:pPr>
+      <w:r>
+        <w:rPr>
+          <w:rFonts w:ascii="Times New Roman" w:eastAsia="Times New Roman" w:hAnsi="Times New Roman" w:cs="Times New Roman"/>
+          <w:sz w:val="24"/>
+          <w:szCs w:val="24"/>
+        </w:rPr>
         <w:t>AC3 time (</w:t>
       </w:r>
       <w:proofErr w:type="spellStart"/>
@@ -1770,7 +1834,7 @@
           <w:sz w:val="24"/>
           <w:szCs w:val="24"/>
         </w:rPr>
-        <w:t>): 6.52</w:t>
+        <w:t>): 9.77</w:t>
       </w:r>
     </w:p>
     <w:p>
@@ -1788,6 +1852,7 @@
           <w:sz w:val="24"/>
           <w:szCs w:val="24"/>
         </w:rPr>
+        <w:lastRenderedPageBreak/>
         <w:t>BT time (</w:t>
       </w:r>
       <w:proofErr w:type="spellStart"/>
@@ -1806,7 +1871,35 @@
           <w:sz w:val="24"/>
           <w:szCs w:val="24"/>
         </w:rPr>
-        <w:t>): 33.82</w:t>
+        <w:t>): 43.61</w:t>
+      </w:r>
+    </w:p>
+    <w:p>
+      <w:pPr>
+        <w:spacing w:after="0" w:line="240" w:lineRule="auto"/>
+        <w:rPr>
+          <w:rFonts w:ascii="Times New Roman" w:eastAsia="Times New Roman" w:hAnsi="Times New Roman" w:cs="Times New Roman"/>
+          <w:sz w:val="24"/>
+          <w:szCs w:val="24"/>
+        </w:rPr>
+      </w:pPr>
+    </w:p>
+    <w:p>
+      <w:pPr>
+        <w:spacing w:after="0" w:line="240" w:lineRule="auto"/>
+        <w:rPr>
+          <w:rFonts w:ascii="Times New Roman" w:eastAsia="Times New Roman" w:hAnsi="Times New Roman" w:cs="Times New Roman"/>
+          <w:sz w:val="24"/>
+          <w:szCs w:val="24"/>
+        </w:rPr>
+      </w:pPr>
+      <w:r>
+        <w:rPr>
+          <w:rFonts w:ascii="Times New Roman" w:eastAsia="Times New Roman" w:hAnsi="Times New Roman" w:cs="Times New Roman"/>
+          <w:sz w:val="24"/>
+          <w:szCs w:val="24"/>
+        </w:rPr>
+        <w:t>--- METRICS ---</w:t>
       </w:r>
     </w:p>
     <w:p>
@@ -1842,7 +1935,7 @@
           <w:sz w:val="24"/>
           <w:szCs w:val="24"/>
         </w:rPr>
-        <w:t>Domain reductions: 0</w:t>
+        <w:t>Domain reductions: 20420</w:t>
       </w:r>
     </w:p>
     <w:p>
@@ -1878,7 +1971,6 @@
           <w:sz w:val="24"/>
           <w:szCs w:val="24"/>
         </w:rPr>
-        <w:lastRenderedPageBreak/>
         <w:t>Queue pops: 1620</w:t>
       </w:r>
     </w:p>
@@ -1897,7 +1989,7 @@
           <w:sz w:val="24"/>
           <w:szCs w:val="24"/>
         </w:rPr>
-        <w:t>Backtracking calls: 2251</w:t>
+        <w:t>Backtracking calls: 1022</w:t>
       </w:r>
       <w:r>
         <w:rPr>
@@ -1935,11 +2027,7 @@
     </w:p>
     <w:p>
       <w:pPr>
-        <w:numPr>
-          <w:ilvl w:val="0"/>
-          <w:numId w:val="15"/>
-        </w:numPr>
-        <w:spacing w:before="100" w:beforeAutospacing="1" w:after="100" w:afterAutospacing="1" w:line="240" w:lineRule="auto"/>
+        <w:spacing w:after="0" w:line="240" w:lineRule="auto"/>
         <w:rPr>
           <w:rFonts w:ascii="Times New Roman" w:eastAsia="Times New Roman" w:hAnsi="Times New Roman" w:cs="Times New Roman"/>
           <w:sz w:val="24"/>
@@ -1952,16 +2040,12 @@
           <w:sz w:val="24"/>
           <w:szCs w:val="24"/>
         </w:rPr>
-        <w:t xml:space="preserve">Clues: 21 </w:t>
+        <w:t>--- TIMING ---</w:t>
       </w:r>
     </w:p>
     <w:p>
       <w:pPr>
-        <w:numPr>
-          <w:ilvl w:val="0"/>
-          <w:numId w:val="15"/>
-        </w:numPr>
-        <w:spacing w:before="100" w:beforeAutospacing="1" w:after="100" w:afterAutospacing="1" w:line="240" w:lineRule="auto"/>
+        <w:spacing w:after="0" w:line="240" w:lineRule="auto"/>
         <w:rPr>
           <w:rFonts w:ascii="Times New Roman" w:eastAsia="Times New Roman" w:hAnsi="Times New Roman" w:cs="Times New Roman"/>
           <w:sz w:val="24"/>
@@ -1974,117 +2058,7 @@
           <w:sz w:val="24"/>
           <w:szCs w:val="24"/>
         </w:rPr>
-        <w:t xml:space="preserve">Empty Cells: 60 </w:t>
-      </w:r>
-    </w:p>
-    <w:p>
-      <w:pPr>
-        <w:numPr>
-          <w:ilvl w:val="0"/>
-          <w:numId w:val="15"/>
-        </w:numPr>
-        <w:spacing w:before="100" w:beforeAutospacing="1" w:after="100" w:afterAutospacing="1" w:line="240" w:lineRule="auto"/>
-        <w:rPr>
-          <w:rFonts w:ascii="Times New Roman" w:eastAsia="Times New Roman" w:hAnsi="Times New Roman" w:cs="Times New Roman"/>
-          <w:sz w:val="24"/>
-          <w:szCs w:val="24"/>
-        </w:rPr>
-      </w:pPr>
-      <w:r>
-        <w:rPr>
-          <w:rFonts w:ascii="Times New Roman" w:eastAsia="Times New Roman" w:hAnsi="Times New Roman" w:cs="Times New Roman"/>
-          <w:sz w:val="24"/>
-          <w:szCs w:val="24"/>
-        </w:rPr>
-        <w:t xml:space="preserve">Arc Checks: 1620 </w:t>
-      </w:r>
-    </w:p>
-    <w:p>
-      <w:pPr>
-        <w:numPr>
-          <w:ilvl w:val="0"/>
-          <w:numId w:val="15"/>
-        </w:numPr>
-        <w:spacing w:before="100" w:beforeAutospacing="1" w:after="100" w:afterAutospacing="1" w:line="240" w:lineRule="auto"/>
-        <w:rPr>
-          <w:rFonts w:ascii="Times New Roman" w:eastAsia="Times New Roman" w:hAnsi="Times New Roman" w:cs="Times New Roman"/>
-          <w:sz w:val="24"/>
-          <w:szCs w:val="24"/>
-        </w:rPr>
-      </w:pPr>
-      <w:r>
-        <w:rPr>
-          <w:rFonts w:ascii="Times New Roman" w:eastAsia="Times New Roman" w:hAnsi="Times New Roman" w:cs="Times New Roman"/>
-          <w:sz w:val="24"/>
-          <w:szCs w:val="24"/>
-        </w:rPr>
-        <w:t xml:space="preserve">Domain Reductions: 0 </w:t>
-      </w:r>
-    </w:p>
-    <w:p>
-      <w:pPr>
-        <w:numPr>
-          <w:ilvl w:val="0"/>
-          <w:numId w:val="15"/>
-        </w:numPr>
-        <w:spacing w:before="100" w:beforeAutospacing="1" w:after="100" w:afterAutospacing="1" w:line="240" w:lineRule="auto"/>
-        <w:rPr>
-          <w:rFonts w:ascii="Times New Roman" w:eastAsia="Times New Roman" w:hAnsi="Times New Roman" w:cs="Times New Roman"/>
-          <w:sz w:val="24"/>
-          <w:szCs w:val="24"/>
-        </w:rPr>
-      </w:pPr>
-      <w:r>
-        <w:rPr>
-          <w:rFonts w:ascii="Times New Roman" w:eastAsia="Times New Roman" w:hAnsi="Times New Roman" w:cs="Times New Roman"/>
-          <w:sz w:val="24"/>
-          <w:szCs w:val="24"/>
-        </w:rPr>
-        <w:t xml:space="preserve">Cells Solved by AC-3: 0 </w:t>
-      </w:r>
-    </w:p>
-    <w:p>
-      <w:pPr>
-        <w:numPr>
-          <w:ilvl w:val="0"/>
-          <w:numId w:val="15"/>
-        </w:numPr>
-        <w:spacing w:before="100" w:beforeAutospacing="1" w:after="100" w:afterAutospacing="1" w:line="240" w:lineRule="auto"/>
-        <w:rPr>
-          <w:rFonts w:ascii="Times New Roman" w:eastAsia="Times New Roman" w:hAnsi="Times New Roman" w:cs="Times New Roman"/>
-          <w:sz w:val="24"/>
-          <w:szCs w:val="24"/>
-        </w:rPr>
-      </w:pPr>
-      <w:r>
-        <w:rPr>
-          <w:rFonts w:ascii="Times New Roman" w:eastAsia="Times New Roman" w:hAnsi="Times New Roman" w:cs="Times New Roman"/>
-          <w:sz w:val="24"/>
-          <w:szCs w:val="24"/>
-        </w:rPr>
-        <w:t xml:space="preserve">Remaining After AC-3: 60 </w:t>
-      </w:r>
-    </w:p>
-    <w:p>
-      <w:pPr>
-        <w:numPr>
-          <w:ilvl w:val="0"/>
-          <w:numId w:val="15"/>
-        </w:numPr>
-        <w:spacing w:before="100" w:beforeAutospacing="1" w:after="100" w:afterAutospacing="1" w:line="240" w:lineRule="auto"/>
-        <w:rPr>
-          <w:rFonts w:ascii="Times New Roman" w:eastAsia="Times New Roman" w:hAnsi="Times New Roman" w:cs="Times New Roman"/>
-          <w:sz w:val="24"/>
-          <w:szCs w:val="24"/>
-        </w:rPr>
-      </w:pPr>
-      <w:r>
-        <w:rPr>
-          <w:rFonts w:ascii="Times New Roman" w:eastAsia="Times New Roman" w:hAnsi="Times New Roman" w:cs="Times New Roman"/>
-          <w:sz w:val="24"/>
-          <w:szCs w:val="24"/>
-        </w:rPr>
-        <w:t xml:space="preserve">AC-3 Time: 4.95 </w:t>
+        <w:t>AC3 time (</w:t>
       </w:r>
       <w:proofErr w:type="spellStart"/>
       <w:r>
@@ -2102,16 +2076,12 @@
           <w:sz w:val="24"/>
           <w:szCs w:val="24"/>
         </w:rPr>
-        <w:t xml:space="preserve"> </w:t>
+        <w:t>): 8.44</w:t>
       </w:r>
     </w:p>
     <w:p>
       <w:pPr>
-        <w:numPr>
-          <w:ilvl w:val="0"/>
-          <w:numId w:val="15"/>
-        </w:numPr>
-        <w:spacing w:before="100" w:beforeAutospacing="1" w:after="100" w:afterAutospacing="1" w:line="240" w:lineRule="auto"/>
+        <w:spacing w:after="0" w:line="240" w:lineRule="auto"/>
         <w:rPr>
           <w:rFonts w:ascii="Times New Roman" w:eastAsia="Times New Roman" w:hAnsi="Times New Roman" w:cs="Times New Roman"/>
           <w:sz w:val="24"/>
@@ -2124,51 +2094,7 @@
           <w:sz w:val="24"/>
           <w:szCs w:val="24"/>
         </w:rPr>
-        <w:t xml:space="preserve">Backtracking Calls: 49,559 </w:t>
-      </w:r>
-    </w:p>
-    <w:p>
-      <w:pPr>
-        <w:numPr>
-          <w:ilvl w:val="0"/>
-          <w:numId w:val="15"/>
-        </w:numPr>
-        <w:spacing w:before="100" w:beforeAutospacing="1" w:after="100" w:afterAutospacing="1" w:line="240" w:lineRule="auto"/>
-        <w:rPr>
-          <w:rFonts w:ascii="Times New Roman" w:eastAsia="Times New Roman" w:hAnsi="Times New Roman" w:cs="Times New Roman"/>
-          <w:sz w:val="24"/>
-          <w:szCs w:val="24"/>
-        </w:rPr>
-      </w:pPr>
-      <w:r>
-        <w:rPr>
-          <w:rFonts w:ascii="Times New Roman" w:eastAsia="Times New Roman" w:hAnsi="Times New Roman" w:cs="Times New Roman"/>
-          <w:sz w:val="24"/>
-          <w:szCs w:val="24"/>
-        </w:rPr>
-        <w:t xml:space="preserve">Backtracking After AC-3: 49,559 </w:t>
-      </w:r>
-    </w:p>
-    <w:p>
-      <w:pPr>
-        <w:numPr>
-          <w:ilvl w:val="0"/>
-          <w:numId w:val="15"/>
-        </w:numPr>
-        <w:spacing w:before="100" w:beforeAutospacing="1" w:after="100" w:afterAutospacing="1" w:line="240" w:lineRule="auto"/>
-        <w:rPr>
-          <w:rFonts w:ascii="Times New Roman" w:eastAsia="Times New Roman" w:hAnsi="Times New Roman" w:cs="Times New Roman"/>
-          <w:sz w:val="24"/>
-          <w:szCs w:val="24"/>
-        </w:rPr>
-      </w:pPr>
-      <w:r>
-        <w:rPr>
-          <w:rFonts w:ascii="Times New Roman" w:eastAsia="Times New Roman" w:hAnsi="Times New Roman" w:cs="Times New Roman"/>
-          <w:sz w:val="24"/>
-          <w:szCs w:val="24"/>
-        </w:rPr>
-        <w:t xml:space="preserve">Total Time: 2005.71 </w:t>
+        <w:t>BT time (</w:t>
       </w:r>
       <w:proofErr w:type="spellStart"/>
       <w:r>
@@ -2186,7 +2112,7 @@
           <w:sz w:val="24"/>
           <w:szCs w:val="24"/>
         </w:rPr>
-        <w:t xml:space="preserve"> </w:t>
+        <w:t>): 1298.42</w:t>
       </w:r>
     </w:p>
     <w:p>
@@ -2198,6 +2124,114 @@
           <w:szCs w:val="24"/>
         </w:rPr>
       </w:pPr>
+    </w:p>
+    <w:p>
+      <w:pPr>
+        <w:spacing w:after="0" w:line="240" w:lineRule="auto"/>
+        <w:rPr>
+          <w:rFonts w:ascii="Times New Roman" w:eastAsia="Times New Roman" w:hAnsi="Times New Roman" w:cs="Times New Roman"/>
+          <w:sz w:val="24"/>
+          <w:szCs w:val="24"/>
+        </w:rPr>
+      </w:pPr>
+      <w:r>
+        <w:rPr>
+          <w:rFonts w:ascii="Times New Roman" w:eastAsia="Times New Roman" w:hAnsi="Times New Roman" w:cs="Times New Roman"/>
+          <w:sz w:val="24"/>
+          <w:szCs w:val="24"/>
+        </w:rPr>
+        <w:t>--- METRICS ---</w:t>
+      </w:r>
+    </w:p>
+    <w:p>
+      <w:pPr>
+        <w:spacing w:after="0" w:line="240" w:lineRule="auto"/>
+        <w:rPr>
+          <w:rFonts w:ascii="Times New Roman" w:eastAsia="Times New Roman" w:hAnsi="Times New Roman" w:cs="Times New Roman"/>
+          <w:sz w:val="24"/>
+          <w:szCs w:val="24"/>
+        </w:rPr>
+      </w:pPr>
+      <w:r>
+        <w:rPr>
+          <w:rFonts w:ascii="Times New Roman" w:eastAsia="Times New Roman" w:hAnsi="Times New Roman" w:cs="Times New Roman"/>
+          <w:sz w:val="24"/>
+          <w:szCs w:val="24"/>
+        </w:rPr>
+        <w:t>Arc checks: 6400</w:t>
+      </w:r>
+    </w:p>
+    <w:p>
+      <w:pPr>
+        <w:spacing w:after="0" w:line="240" w:lineRule="auto"/>
+        <w:rPr>
+          <w:rFonts w:ascii="Times New Roman" w:eastAsia="Times New Roman" w:hAnsi="Times New Roman" w:cs="Times New Roman"/>
+          <w:sz w:val="24"/>
+          <w:szCs w:val="24"/>
+        </w:rPr>
+      </w:pPr>
+      <w:r>
+        <w:rPr>
+          <w:rFonts w:ascii="Times New Roman" w:eastAsia="Times New Roman" w:hAnsi="Times New Roman" w:cs="Times New Roman"/>
+          <w:sz w:val="24"/>
+          <w:szCs w:val="24"/>
+        </w:rPr>
+        <w:t>Domain reductions: 820920</w:t>
+      </w:r>
+    </w:p>
+    <w:p>
+      <w:pPr>
+        <w:spacing w:after="0" w:line="240" w:lineRule="auto"/>
+        <w:rPr>
+          <w:rFonts w:ascii="Times New Roman" w:eastAsia="Times New Roman" w:hAnsi="Times New Roman" w:cs="Times New Roman"/>
+          <w:sz w:val="24"/>
+          <w:szCs w:val="24"/>
+        </w:rPr>
+      </w:pPr>
+      <w:r>
+        <w:rPr>
+          <w:rFonts w:ascii="Times New Roman" w:eastAsia="Times New Roman" w:hAnsi="Times New Roman" w:cs="Times New Roman"/>
+          <w:sz w:val="24"/>
+          <w:szCs w:val="24"/>
+        </w:rPr>
+        <w:t>Queue pushes: 1620</w:t>
+      </w:r>
+    </w:p>
+    <w:p>
+      <w:pPr>
+        <w:spacing w:after="0" w:line="240" w:lineRule="auto"/>
+        <w:rPr>
+          <w:rFonts w:ascii="Times New Roman" w:eastAsia="Times New Roman" w:hAnsi="Times New Roman" w:cs="Times New Roman"/>
+          <w:sz w:val="24"/>
+          <w:szCs w:val="24"/>
+        </w:rPr>
+      </w:pPr>
+      <w:r>
+        <w:rPr>
+          <w:rFonts w:ascii="Times New Roman" w:eastAsia="Times New Roman" w:hAnsi="Times New Roman" w:cs="Times New Roman"/>
+          <w:sz w:val="24"/>
+          <w:szCs w:val="24"/>
+        </w:rPr>
+        <w:t>Queue pops: 1620</w:t>
+      </w:r>
+    </w:p>
+    <w:p>
+      <w:pPr>
+        <w:spacing w:after="0" w:line="240" w:lineRule="auto"/>
+        <w:rPr>
+          <w:rFonts w:ascii="Times New Roman" w:eastAsia="Times New Roman" w:hAnsi="Times New Roman" w:cs="Times New Roman"/>
+          <w:sz w:val="24"/>
+          <w:szCs w:val="24"/>
+        </w:rPr>
+      </w:pPr>
+      <w:r>
+        <w:rPr>
+          <w:rFonts w:ascii="Times New Roman" w:eastAsia="Times New Roman" w:hAnsi="Times New Roman" w:cs="Times New Roman"/>
+          <w:sz w:val="24"/>
+          <w:szCs w:val="24"/>
+        </w:rPr>
+        <w:t>Backtracking calls: 41047</w:t>
+      </w:r>
       <w:r>
         <w:rPr>
           <w:rFonts w:ascii="Times New Roman" w:eastAsia="Times New Roman" w:hAnsi="Times New Roman" w:cs="Times New Roman"/>
@@ -2503,6 +2537,7 @@
           <w:sz w:val="24"/>
           <w:szCs w:val="24"/>
         </w:rPr>
+        <w:lastRenderedPageBreak/>
         <w:t xml:space="preserve">Easy: negligible usage </w:t>
       </w:r>
     </w:p>
@@ -2565,7 +2600,6 @@
           <w:sz w:val="24"/>
           <w:szCs w:val="24"/>
         </w:rPr>
-        <w:lastRenderedPageBreak/>
         <w:t>This confirms that:</w:t>
       </w:r>
     </w:p>
@@ -3125,6 +3159,7 @@
           <w:sz w:val="24"/>
           <w:szCs w:val="24"/>
         </w:rPr>
+        <w:lastRenderedPageBreak/>
         <w:t>This study demonstrates that integrating AC-3 with backtracking significantly improves Sudoku solving performance, especially for low- and medium-difficulty puzzles.</w:t>
       </w:r>
     </w:p>
@@ -3165,7 +3200,6 @@
           <w:sz w:val="24"/>
           <w:szCs w:val="24"/>
         </w:rPr>
-        <w:lastRenderedPageBreak/>
         <w:t xml:space="preserve">AC-3 fails to sufficiently reduce domains </w:t>
       </w:r>
     </w:p>

</xml_diff>